<commit_message>
Run security monitoring on three VMs and leave the drive type open
The system engineer confirmed that the SIEM needs three virtual
machines, for indexing, management and the dashboard. The VM inventory,
Figure 9.1 and the counts follow: 18 VMs at the primary site, 9 at the
secondary site with standby copies of all three, 35 EDR endpoints and
16 backed-up workloads. The application hosts also list the load
balancer VMs they carry.

The storage array no longer specifies solid-state drives, which the
RFP does not require, so a hybrid pool can be offered at the primary
site. The secondary site's internal storage never named a drive type.

Co-Authored-By: Claude Opus 5.5 <noreply@anthropic.com>
Claude-Session: https://claude.ai/code/session_01G5KtDfxnVyqdZUVCaXFbWe
</commit_message>
<xml_diff>
--- a/Preliminary-Project-Plan-Information-System-Sub-Plans.docx
+++ b/Preliminary-Project-Plan-Information-System-Sub-Plans.docx
@@ -48192,7 +48192,7 @@
                 <w:i w:val="false"/>
                 <w:iCs w:val="false"/>
               </w:rPr>
-              <w:t xml:space="preserve">33: the 5 hosts; 18 virtual machines, being the 14 production and 2 non-production virtual machines at the primary site, and the domain controller and the database copy at the secondary site; and the 10 workstations. The standby copies at the secondary site run only in place of the virtual machines they copy</w:t>
+              <w:t xml:space="preserve">35: the 5 hosts; 20 virtual machines, being the 16 production and 2 non-production virtual machines at the primary site, and the domain controller and the database copy at the secondary site; and the 10 workstations. The standby copies at the secondary site run only in place of the virtual machines they copy</w:t>
             </w:r>
           </w:p>
         </w:tc>
@@ -48804,7 +48804,7 @@
                 <w:i w:val="false"/>
                 <w:iCs w:val="false"/>
               </w:rPr>
-              <w:t xml:space="preserve">14, the production virtual machines at the primary site, with configuration and audit logs, replicated to the secondary site</w:t>
+              <w:t xml:space="preserve">16, the production virtual machines at the primary site, with configuration and audit logs, replicated to the secondary site</w:t>
             </w:r>
           </w:p>
         </w:tc>

</xml_diff>

<commit_message>
State the Windows Server licence quantity without a core count
Annex A counted 240 core licences from 24-core processors, but the
server quotation may change the core count. The row now licenses all
physical cores of the 5 hosts, which holds whatever processors are
chosen, so the Project Plan can be shared before the quotation is final.

Co-Authored-By: Claude Opus 5.5 <noreply@anthropic.com>
Claude-Session: https://claude.ai/code/session_01G5KtDfxnVyqdZUVCaXFbWe
</commit_message>
<xml_diff>
--- a/Preliminary-Project-Plan-Information-System-Sub-Plans.docx
+++ b/Preliminary-Project-Plan-Information-System-Sub-Plans.docx
@@ -47132,9 +47132,9 @@
       </w:tblPr>
       <w:tblGrid>
         <w:gridCol w:w="1340"/>
-        <w:gridCol w:w="1876"/>
-        <w:gridCol w:w="2015"/>
-        <w:gridCol w:w="3789"/>
+        <w:gridCol w:w="1903"/>
+        <w:gridCol w:w="1923"/>
+        <w:gridCol w:w="3854"/>
       </w:tblGrid>
       <w:tr>
         <w:trPr>
@@ -47168,7 +47168,7 @@
         </w:tc>
         <w:tc>
           <w:tcPr>
-            <w:tcW w:type="dxa" w:w="1876"/>
+            <w:tcW w:type="dxa" w:w="1903"/>
             <w:shd w:fill="EDEDED" w:val="clear"/>
             <w:tcMar>
               <w:top w:type="dxa" w:w="60"/>
@@ -47194,7 +47194,7 @@
         </w:tc>
         <w:tc>
           <w:tcPr>
-            <w:tcW w:type="dxa" w:w="2015"/>
+            <w:tcW w:type="dxa" w:w="1923"/>
             <w:shd w:fill="EDEDED" w:val="clear"/>
             <w:tcMar>
               <w:top w:type="dxa" w:w="60"/>
@@ -47220,7 +47220,7 @@
         </w:tc>
         <w:tc>
           <w:tcPr>
-            <w:tcW w:type="dxa" w:w="3789"/>
+            <w:tcW w:type="dxa" w:w="3854"/>
             <w:shd w:fill="EDEDED" w:val="clear"/>
             <w:tcMar>
               <w:top w:type="dxa" w:w="60"/>
@@ -47273,7 +47273,7 @@
         </w:tc>
         <w:tc>
           <w:tcPr>
-            <w:tcW w:type="dxa" w:w="1876"/>
+            <w:tcW w:type="dxa" w:w="1903"/>
             <w:tcMar>
               <w:top w:type="dxa" w:w="60"/>
               <w:left w:type="dxa" w:w="100"/>
@@ -47298,32 +47298,32 @@
         </w:tc>
         <w:tc>
           <w:tcPr>
-            <w:tcW w:type="dxa" w:w="2015"/>
-            <w:tcMar>
-              <w:top w:type="dxa" w:w="60"/>
-              <w:left w:type="dxa" w:w="100"/>
-              <w:bottom w:type="dxa" w:w="60"/>
-              <w:right w:type="dxa" w:w="100"/>
-            </w:tcMar>
-          </w:tcPr>
-          <w:p>
-            <w:pPr>
-              <w:spacing w:after="0" w:before="0"/>
-            </w:pPr>
-            <w:r>
-              <w:rPr>
-                <w:b w:val="false"/>
-                <w:bCs w:val="false"/>
-                <w:i w:val="false"/>
-                <w:iCs w:val="false"/>
-              </w:rPr>
-              <w:t xml:space="preserve">240 core licenses: 5 hosts of two 24-core processors, 4 at the primary site and 1 at the secondary site</w:t>
-            </w:r>
-          </w:p>
-        </w:tc>
-        <w:tc>
-          <w:tcPr>
-            <w:tcW w:type="dxa" w:w="3789"/>
+            <w:tcW w:type="dxa" w:w="1923"/>
+            <w:tcMar>
+              <w:top w:type="dxa" w:w="60"/>
+              <w:left w:type="dxa" w:w="100"/>
+              <w:bottom w:type="dxa" w:w="60"/>
+              <w:right w:type="dxa" w:w="100"/>
+            </w:tcMar>
+          </w:tcPr>
+          <w:p>
+            <w:pPr>
+              <w:spacing w:after="0" w:before="0"/>
+            </w:pPr>
+            <w:r>
+              <w:rPr>
+                <w:b w:val="false"/>
+                <w:bCs w:val="false"/>
+                <w:i w:val="false"/>
+                <w:iCs w:val="false"/>
+              </w:rPr>
+              <w:t xml:space="preserve">All physical cores of the 5 hosts, 4 at the primary site and 1 at the secondary site</w:t>
+            </w:r>
+          </w:p>
+        </w:tc>
+        <w:tc>
+          <w:tcPr>
+            <w:tcW w:type="dxa" w:w="3854"/>
             <w:tcMar>
               <w:top w:type="dxa" w:w="60"/>
               <w:left w:type="dxa" w:w="100"/>
@@ -47375,7 +47375,7 @@
         </w:tc>
         <w:tc>
           <w:tcPr>
-            <w:tcW w:type="dxa" w:w="1876"/>
+            <w:tcW w:type="dxa" w:w="1903"/>
             <w:tcMar>
               <w:top w:type="dxa" w:w="60"/>
               <w:left w:type="dxa" w:w="100"/>
@@ -47400,7 +47400,7 @@
         </w:tc>
         <w:tc>
           <w:tcPr>
-            <w:tcW w:type="dxa" w:w="2015"/>
+            <w:tcW w:type="dxa" w:w="1923"/>
             <w:tcMar>
               <w:top w:type="dxa" w:w="60"/>
               <w:left w:type="dxa" w:w="100"/>
@@ -47425,7 +47425,7 @@
         </w:tc>
         <w:tc>
           <w:tcPr>
-            <w:tcW w:type="dxa" w:w="3789"/>
+            <w:tcW w:type="dxa" w:w="3854"/>
             <w:tcMar>
               <w:top w:type="dxa" w:w="60"/>
               <w:left w:type="dxa" w:w="100"/>
@@ -47477,7 +47477,7 @@
         </w:tc>
         <w:tc>
           <w:tcPr>
-            <w:tcW w:type="dxa" w:w="1876"/>
+            <w:tcW w:type="dxa" w:w="1903"/>
             <w:tcMar>
               <w:top w:type="dxa" w:w="60"/>
               <w:left w:type="dxa" w:w="100"/>
@@ -47502,7 +47502,7 @@
         </w:tc>
         <w:tc>
           <w:tcPr>
-            <w:tcW w:type="dxa" w:w="2015"/>
+            <w:tcW w:type="dxa" w:w="1923"/>
             <w:tcMar>
               <w:top w:type="dxa" w:w="60"/>
               <w:left w:type="dxa" w:w="100"/>
@@ -47527,7 +47527,7 @@
         </w:tc>
         <w:tc>
           <w:tcPr>
-            <w:tcW w:type="dxa" w:w="3789"/>
+            <w:tcW w:type="dxa" w:w="3854"/>
             <w:tcMar>
               <w:top w:type="dxa" w:w="60"/>
               <w:left w:type="dxa" w:w="100"/>
@@ -47579,7 +47579,7 @@
         </w:tc>
         <w:tc>
           <w:tcPr>
-            <w:tcW w:type="dxa" w:w="1876"/>
+            <w:tcW w:type="dxa" w:w="1903"/>
             <w:tcMar>
               <w:top w:type="dxa" w:w="60"/>
               <w:left w:type="dxa" w:w="100"/>
@@ -47604,7 +47604,7 @@
         </w:tc>
         <w:tc>
           <w:tcPr>
-            <w:tcW w:type="dxa" w:w="2015"/>
+            <w:tcW w:type="dxa" w:w="1923"/>
             <w:tcMar>
               <w:top w:type="dxa" w:w="60"/>
               <w:left w:type="dxa" w:w="100"/>
@@ -47629,7 +47629,7 @@
         </w:tc>
         <w:tc>
           <w:tcPr>
-            <w:tcW w:type="dxa" w:w="3789"/>
+            <w:tcW w:type="dxa" w:w="3854"/>
             <w:tcMar>
               <w:top w:type="dxa" w:w="60"/>
               <w:left w:type="dxa" w:w="100"/>
@@ -47681,7 +47681,7 @@
         </w:tc>
         <w:tc>
           <w:tcPr>
-            <w:tcW w:type="dxa" w:w="1876"/>
+            <w:tcW w:type="dxa" w:w="1903"/>
             <w:tcMar>
               <w:top w:type="dxa" w:w="60"/>
               <w:left w:type="dxa" w:w="100"/>
@@ -47706,7 +47706,7 @@
         </w:tc>
         <w:tc>
           <w:tcPr>
-            <w:tcW w:type="dxa" w:w="2015"/>
+            <w:tcW w:type="dxa" w:w="1923"/>
             <w:tcMar>
               <w:top w:type="dxa" w:w="60"/>
               <w:left w:type="dxa" w:w="100"/>
@@ -47731,7 +47731,7 @@
         </w:tc>
         <w:tc>
           <w:tcPr>
-            <w:tcW w:type="dxa" w:w="3789"/>
+            <w:tcW w:type="dxa" w:w="3854"/>
             <w:tcMar>
               <w:top w:type="dxa" w:w="60"/>
               <w:left w:type="dxa" w:w="100"/>
@@ -47783,7 +47783,7 @@
         </w:tc>
         <w:tc>
           <w:tcPr>
-            <w:tcW w:type="dxa" w:w="1876"/>
+            <w:tcW w:type="dxa" w:w="1903"/>
             <w:tcMar>
               <w:top w:type="dxa" w:w="60"/>
               <w:left w:type="dxa" w:w="100"/>
@@ -47808,7 +47808,7 @@
         </w:tc>
         <w:tc>
           <w:tcPr>
-            <w:tcW w:type="dxa" w:w="2015"/>
+            <w:tcW w:type="dxa" w:w="1923"/>
             <w:tcMar>
               <w:top w:type="dxa" w:w="60"/>
               <w:left w:type="dxa" w:w="100"/>
@@ -47833,7 +47833,7 @@
         </w:tc>
         <w:tc>
           <w:tcPr>
-            <w:tcW w:type="dxa" w:w="3789"/>
+            <w:tcW w:type="dxa" w:w="3854"/>
             <w:tcMar>
               <w:top w:type="dxa" w:w="60"/>
               <w:left w:type="dxa" w:w="100"/>

</xml_diff>

<commit_message>
License SQL Server per server with 120 CALs, and drop the extra Veeam VM
- SQL Server Standard is now one server license for the database VM with
  120 client access licenses, under Software Assurance, in place of
  per-core licensing.
- Security monitoring is described as three VMs for the MSOC platform
  and one for MDR, four in all.
- The running Veeam VM at the secondary site is removed, because the
  standby copy of the backup server covers it. The site goes back to 10
  VMs, endpoint detection and response becomes 33 endpoints, and
  Figures 9.1 and 9.2 drop the Veeam server.

Co-Authored-By: Claude Opus 5.5 <noreply@anthropic.com>
Claude-Session: https://claude.ai/code/session_01G5KtDfxnVyqdZUVCaXFbWe
</commit_message>
<xml_diff>
--- a/Preliminary-Project-Plan-Information-System-Sub-Plans.docx
+++ b/Preliminary-Project-Plan-Information-System-Sub-Plans.docx
@@ -47133,8 +47133,8 @@
       <w:tblGrid>
         <w:gridCol w:w="1780"/>
         <w:gridCol w:w="1670"/>
-        <w:gridCol w:w="2907"/>
-        <w:gridCol w:w="2663"/>
+        <w:gridCol w:w="2911"/>
+        <w:gridCol w:w="2659"/>
       </w:tblGrid>
       <w:tr>
         <w:trPr>
@@ -47194,7 +47194,7 @@
         </w:tc>
         <w:tc>
           <w:tcPr>
-            <w:tcW w:type="dxa" w:w="2907"/>
+            <w:tcW w:type="dxa" w:w="2911"/>
             <w:shd w:fill="EDEDED" w:val="clear"/>
             <w:tcMar>
               <w:top w:type="dxa" w:w="60"/>
@@ -47220,7 +47220,7 @@
         </w:tc>
         <w:tc>
           <w:tcPr>
-            <w:tcW w:type="dxa" w:w="2663"/>
+            <w:tcW w:type="dxa" w:w="2659"/>
             <w:shd w:fill="EDEDED" w:val="clear"/>
             <w:tcMar>
               <w:top w:type="dxa" w:w="60"/>
@@ -47298,7 +47298,7 @@
         </w:tc>
         <w:tc>
           <w:tcPr>
-            <w:tcW w:type="dxa" w:w="2907"/>
+            <w:tcW w:type="dxa" w:w="2911"/>
             <w:tcMar>
               <w:top w:type="dxa" w:w="60"/>
               <w:left w:type="dxa" w:w="100"/>
@@ -47323,7 +47323,7 @@
         </w:tc>
         <w:tc>
           <w:tcPr>
-            <w:tcW w:type="dxa" w:w="2663"/>
+            <w:tcW w:type="dxa" w:w="2659"/>
             <w:tcMar>
               <w:top w:type="dxa" w:w="60"/>
               <w:left w:type="dxa" w:w="100"/>
@@ -47400,7 +47400,7 @@
         </w:tc>
         <w:tc>
           <w:tcPr>
-            <w:tcW w:type="dxa" w:w="2907"/>
+            <w:tcW w:type="dxa" w:w="2911"/>
             <w:tcMar>
               <w:top w:type="dxa" w:w="60"/>
               <w:left w:type="dxa" w:w="100"/>
@@ -47425,7 +47425,7 @@
         </w:tc>
         <w:tc>
           <w:tcPr>
-            <w:tcW w:type="dxa" w:w="2663"/>
+            <w:tcW w:type="dxa" w:w="2659"/>
             <w:tcMar>
               <w:top w:type="dxa" w:w="60"/>
               <w:left w:type="dxa" w:w="100"/>
@@ -47496,38 +47496,38 @@
                 <w:i w:val="false"/>
                 <w:iCs w:val="false"/>
               </w:rPr>
-              <w:t xml:space="preserve">Per virtual core, not fewer than four per virtual machine, with Software Assurance</w:t>
-            </w:r>
-          </w:p>
-        </w:tc>
-        <w:tc>
-          <w:tcPr>
-            <w:tcW w:type="dxa" w:w="2907"/>
-            <w:tcMar>
-              <w:top w:type="dxa" w:w="60"/>
-              <w:left w:type="dxa" w:w="100"/>
-              <w:bottom w:type="dxa" w:w="60"/>
-              <w:right w:type="dxa" w:w="100"/>
-            </w:tcMar>
-          </w:tcPr>
-          <w:p>
-            <w:pPr>
-              <w:spacing w:after="0" w:before="0"/>
-            </w:pPr>
-            <w:r>
-              <w:rPr>
-                <w:b w:val="false"/>
-                <w:bCs w:val="false"/>
-                <w:i w:val="false"/>
-                <w:iCs w:val="false"/>
-              </w:rPr>
-              <w:t xml:space="preserve">The virtual cores allocated to the database virtual machine</w:t>
-            </w:r>
-          </w:p>
-        </w:tc>
-        <w:tc>
-          <w:tcPr>
-            <w:tcW w:type="dxa" w:w="2663"/>
+              <w:t xml:space="preserve">Per server, with client access licenses, and Software Assurance</w:t>
+            </w:r>
+          </w:p>
+        </w:tc>
+        <w:tc>
+          <w:tcPr>
+            <w:tcW w:type="dxa" w:w="2911"/>
+            <w:tcMar>
+              <w:top w:type="dxa" w:w="60"/>
+              <w:left w:type="dxa" w:w="100"/>
+              <w:bottom w:type="dxa" w:w="60"/>
+              <w:right w:type="dxa" w:w="100"/>
+            </w:tcMar>
+          </w:tcPr>
+          <w:p>
+            <w:pPr>
+              <w:spacing w:after="0" w:before="0"/>
+            </w:pPr>
+            <w:r>
+              <w:rPr>
+                <w:b w:val="false"/>
+                <w:bCs w:val="false"/>
+                <w:i w:val="false"/>
+                <w:iCs w:val="false"/>
+              </w:rPr>
+              <w:t xml:space="preserve">One server license for the database virtual machine, with 120 client access licenses</w:t>
+            </w:r>
+          </w:p>
+        </w:tc>
+        <w:tc>
+          <w:tcPr>
+            <w:tcW w:type="dxa" w:w="2659"/>
             <w:tcMar>
               <w:top w:type="dxa" w:w="60"/>
               <w:left w:type="dxa" w:w="100"/>
@@ -47604,7 +47604,7 @@
         </w:tc>
         <w:tc>
           <w:tcPr>
-            <w:tcW w:type="dxa" w:w="2907"/>
+            <w:tcW w:type="dxa" w:w="2911"/>
             <w:tcMar>
               <w:top w:type="dxa" w:w="60"/>
               <w:left w:type="dxa" w:w="100"/>
@@ -47629,7 +47629,7 @@
         </w:tc>
         <w:tc>
           <w:tcPr>
-            <w:tcW w:type="dxa" w:w="2663"/>
+            <w:tcW w:type="dxa" w:w="2659"/>
             <w:tcMar>
               <w:top w:type="dxa" w:w="60"/>
               <w:left w:type="dxa" w:w="100"/>
@@ -47706,7 +47706,7 @@
         </w:tc>
         <w:tc>
           <w:tcPr>
-            <w:tcW w:type="dxa" w:w="2907"/>
+            <w:tcW w:type="dxa" w:w="2911"/>
             <w:tcMar>
               <w:top w:type="dxa" w:w="60"/>
               <w:left w:type="dxa" w:w="100"/>
@@ -47731,7 +47731,7 @@
         </w:tc>
         <w:tc>
           <w:tcPr>
-            <w:tcW w:type="dxa" w:w="2663"/>
+            <w:tcW w:type="dxa" w:w="2659"/>
             <w:tcMar>
               <w:top w:type="dxa" w:w="60"/>
               <w:left w:type="dxa" w:w="100"/>
@@ -47808,32 +47808,32 @@
         </w:tc>
         <w:tc>
           <w:tcPr>
-            <w:tcW w:type="dxa" w:w="2907"/>
-            <w:tcMar>
-              <w:top w:type="dxa" w:w="60"/>
-              <w:left w:type="dxa" w:w="100"/>
-              <w:bottom w:type="dxa" w:w="60"/>
-              <w:right w:type="dxa" w:w="100"/>
-            </w:tcMar>
-          </w:tcPr>
-          <w:p>
-            <w:pPr>
-              <w:spacing w:after="0" w:before="0"/>
-            </w:pPr>
-            <w:r>
-              <w:rPr>
-                <w:b w:val="false"/>
-                <w:bCs w:val="false"/>
-                <w:i w:val="false"/>
-                <w:iCs w:val="false"/>
-              </w:rPr>
-              <w:t xml:space="preserve">34: the 5 hosts; 19 virtual machines, being the 14 production and 2 non-production virtual machines at the primary site, and the domain controller, the database copy and the Veeam server at the secondary site; and the 10 workstations. The standby copies at the secondary site run only in place of the virtual machines they copy</w:t>
-            </w:r>
-          </w:p>
-        </w:tc>
-        <w:tc>
-          <w:tcPr>
-            <w:tcW w:type="dxa" w:w="2663"/>
+            <w:tcW w:type="dxa" w:w="2911"/>
+            <w:tcMar>
+              <w:top w:type="dxa" w:w="60"/>
+              <w:left w:type="dxa" w:w="100"/>
+              <w:bottom w:type="dxa" w:w="60"/>
+              <w:right w:type="dxa" w:w="100"/>
+            </w:tcMar>
+          </w:tcPr>
+          <w:p>
+            <w:pPr>
+              <w:spacing w:after="0" w:before="0"/>
+            </w:pPr>
+            <w:r>
+              <w:rPr>
+                <w:b w:val="false"/>
+                <w:bCs w:val="false"/>
+                <w:i w:val="false"/>
+                <w:iCs w:val="false"/>
+              </w:rPr>
+              <w:t xml:space="preserve">33: the 5 hosts; 18 virtual machines, being the 14 production and 2 non-production virtual machines at the primary site, and the domain controller and the database copy at the secondary site; and the 10 workstations. The standby copies at the secondary site run only in place of the virtual machines they copy</w:t>
+            </w:r>
+          </w:p>
+        </w:tc>
+        <w:tc>
+          <w:tcPr>
+            <w:tcW w:type="dxa" w:w="2659"/>
             <w:tcMar>
               <w:top w:type="dxa" w:w="60"/>
               <w:left w:type="dxa" w:w="100"/>
@@ -47910,7 +47910,7 @@
         </w:tc>
         <w:tc>
           <w:tcPr>
-            <w:tcW w:type="dxa" w:w="2907"/>
+            <w:tcW w:type="dxa" w:w="2911"/>
             <w:tcMar>
               <w:top w:type="dxa" w:w="60"/>
               <w:left w:type="dxa" w:w="100"/>
@@ -47935,7 +47935,7 @@
         </w:tc>
         <w:tc>
           <w:tcPr>
-            <w:tcW w:type="dxa" w:w="2663"/>
+            <w:tcW w:type="dxa" w:w="2659"/>
             <w:tcMar>
               <w:top w:type="dxa" w:w="60"/>
               <w:left w:type="dxa" w:w="100"/>
@@ -48012,7 +48012,7 @@
         </w:tc>
         <w:tc>
           <w:tcPr>
-            <w:tcW w:type="dxa" w:w="2907"/>
+            <w:tcW w:type="dxa" w:w="2911"/>
             <w:tcMar>
               <w:top w:type="dxa" w:w="60"/>
               <w:left w:type="dxa" w:w="100"/>
@@ -48037,7 +48037,7 @@
         </w:tc>
         <w:tc>
           <w:tcPr>
-            <w:tcW w:type="dxa" w:w="2663"/>
+            <w:tcW w:type="dxa" w:w="2659"/>
             <w:tcMar>
               <w:top w:type="dxa" w:w="60"/>
               <w:left w:type="dxa" w:w="100"/>
@@ -48114,7 +48114,7 @@
         </w:tc>
         <w:tc>
           <w:tcPr>
-            <w:tcW w:type="dxa" w:w="2907"/>
+            <w:tcW w:type="dxa" w:w="2911"/>
             <w:tcMar>
               <w:top w:type="dxa" w:w="60"/>
               <w:left w:type="dxa" w:w="100"/>
@@ -48139,7 +48139,7 @@
         </w:tc>
         <w:tc>
           <w:tcPr>
-            <w:tcW w:type="dxa" w:w="2663"/>
+            <w:tcW w:type="dxa" w:w="2659"/>
             <w:tcMar>
               <w:top w:type="dxa" w:w="60"/>
               <w:left w:type="dxa" w:w="100"/>
@@ -48216,7 +48216,7 @@
         </w:tc>
         <w:tc>
           <w:tcPr>
-            <w:tcW w:type="dxa" w:w="2907"/>
+            <w:tcW w:type="dxa" w:w="2911"/>
             <w:tcMar>
               <w:top w:type="dxa" w:w="60"/>
               <w:left w:type="dxa" w:w="100"/>
@@ -48241,7 +48241,7 @@
         </w:tc>
         <w:tc>
           <w:tcPr>
-            <w:tcW w:type="dxa" w:w="2663"/>
+            <w:tcW w:type="dxa" w:w="2659"/>
             <w:tcMar>
               <w:top w:type="dxa" w:w="60"/>
               <w:left w:type="dxa" w:w="100"/>
@@ -48318,7 +48318,7 @@
         </w:tc>
         <w:tc>
           <w:tcPr>
-            <w:tcW w:type="dxa" w:w="2907"/>
+            <w:tcW w:type="dxa" w:w="2911"/>
             <w:tcMar>
               <w:top w:type="dxa" w:w="60"/>
               <w:left w:type="dxa" w:w="100"/>
@@ -48343,7 +48343,7 @@
         </w:tc>
         <w:tc>
           <w:tcPr>
-            <w:tcW w:type="dxa" w:w="2663"/>
+            <w:tcW w:type="dxa" w:w="2659"/>
             <w:tcMar>
               <w:top w:type="dxa" w:w="60"/>
               <w:left w:type="dxa" w:w="100"/>
@@ -48420,7 +48420,7 @@
         </w:tc>
         <w:tc>
           <w:tcPr>
-            <w:tcW w:type="dxa" w:w="2907"/>
+            <w:tcW w:type="dxa" w:w="2911"/>
             <w:tcMar>
               <w:top w:type="dxa" w:w="60"/>
               <w:left w:type="dxa" w:w="100"/>
@@ -48445,7 +48445,7 @@
         </w:tc>
         <w:tc>
           <w:tcPr>
-            <w:tcW w:type="dxa" w:w="2663"/>
+            <w:tcW w:type="dxa" w:w="2659"/>
             <w:tcMar>
               <w:top w:type="dxa" w:w="60"/>
               <w:left w:type="dxa" w:w="100"/>
@@ -48522,7 +48522,7 @@
         </w:tc>
         <w:tc>
           <w:tcPr>
-            <w:tcW w:type="dxa" w:w="2907"/>
+            <w:tcW w:type="dxa" w:w="2911"/>
             <w:tcMar>
               <w:top w:type="dxa" w:w="60"/>
               <w:left w:type="dxa" w:w="100"/>
@@ -48547,7 +48547,7 @@
         </w:tc>
         <w:tc>
           <w:tcPr>
-            <w:tcW w:type="dxa" w:w="2663"/>
+            <w:tcW w:type="dxa" w:w="2659"/>
             <w:tcMar>
               <w:top w:type="dxa" w:w="60"/>
               <w:left w:type="dxa" w:w="100"/>
@@ -48624,7 +48624,7 @@
         </w:tc>
         <w:tc>
           <w:tcPr>
-            <w:tcW w:type="dxa" w:w="2907"/>
+            <w:tcW w:type="dxa" w:w="2911"/>
             <w:tcMar>
               <w:top w:type="dxa" w:w="60"/>
               <w:left w:type="dxa" w:w="100"/>
@@ -48649,7 +48649,7 @@
         </w:tc>
         <w:tc>
           <w:tcPr>
-            <w:tcW w:type="dxa" w:w="2663"/>
+            <w:tcW w:type="dxa" w:w="2659"/>
             <w:tcMar>
               <w:top w:type="dxa" w:w="60"/>
               <w:left w:type="dxa" w:w="100"/>
@@ -48726,7 +48726,7 @@
         </w:tc>
         <w:tc>
           <w:tcPr>
-            <w:tcW w:type="dxa" w:w="2907"/>
+            <w:tcW w:type="dxa" w:w="2911"/>
             <w:tcMar>
               <w:top w:type="dxa" w:w="60"/>
               <w:left w:type="dxa" w:w="100"/>
@@ -48751,7 +48751,7 @@
         </w:tc>
         <w:tc>
           <w:tcPr>
-            <w:tcW w:type="dxa" w:w="2663"/>
+            <w:tcW w:type="dxa" w:w="2659"/>
             <w:tcMar>
               <w:top w:type="dxa" w:w="60"/>
               <w:left w:type="dxa" w:w="100"/>
@@ -48792,7 +48792,7 @@
           <w:i w:val="false"/>
           <w:iCs w:val="false"/>
         </w:rPr>
-        <w:t xml:space="preserve">The application hosts and the secondary host carry Windows Server Datacenter, because the edition licenses an unlimited number of Windows Server virtual machines on the host it covers: either application host runs every production virtual machine of the application cluster when the other is lost, together with the non-production environments, and the secondary host runs the eleven virtual machines of the secondary environment. The database hosts carry Windows Server Standard, which licenses two Windows Server virtual machines on each fully licensed host, more than the one database virtual machine either host runs.</w:t>
+        <w:t xml:space="preserve">The application hosts and the secondary host carry Windows Server Datacenter, because the edition licenses an unlimited number of Windows Server virtual machines on the host it covers: either application host runs every production virtual machine of the application cluster when the other is lost, together with the non-production environments, and the secondary host runs the ten virtual machines of the secondary environment. The database hosts carry Windows Server Standard, which licenses two Windows Server virtual machines on each fully licensed host, more than the one database virtual machine either host runs.</w:t>
       </w:r>
     </w:p>
     <w:p>
@@ -50323,8 +50323,8 @@
         </w:tblBorders>
       </w:tblPr>
       <w:tblGrid>
-        <w:gridCol w:w="2942"/>
-        <w:gridCol w:w="6078"/>
+        <w:gridCol w:w="2806"/>
+        <w:gridCol w:w="6214"/>
       </w:tblGrid>
       <w:tr>
         <w:trPr>
@@ -50332,7 +50332,7 @@
         </w:trPr>
         <w:tc>
           <w:tcPr>
-            <w:tcW w:type="dxa" w:w="2942"/>
+            <w:tcW w:type="dxa" w:w="2806"/>
             <w:shd w:fill="EDEDED" w:val="clear"/>
             <w:tcMar>
               <w:top w:type="dxa" w:w="60"/>
@@ -50358,7 +50358,7 @@
         </w:tc>
         <w:tc>
           <w:tcPr>
-            <w:tcW w:type="dxa" w:w="6078"/>
+            <w:tcW w:type="dxa" w:w="6214"/>
             <w:shd w:fill="EDEDED" w:val="clear"/>
             <w:tcMar>
               <w:top w:type="dxa" w:w="60"/>
@@ -50386,7 +50386,7 @@
       <w:tr>
         <w:tc>
           <w:tcPr>
-            <w:tcW w:type="dxa" w:w="2942"/>
+            <w:tcW w:type="dxa" w:w="2806"/>
             <w:tcMar>
               <w:top w:type="dxa" w:w="60"/>
               <w:left w:type="dxa" w:w="100"/>
@@ -50411,7 +50411,7 @@
         </w:tc>
         <w:tc>
           <w:tcPr>
-            <w:tcW w:type="dxa" w:w="6078"/>
+            <w:tcW w:type="dxa" w:w="6214"/>
             <w:tcMar>
               <w:top w:type="dxa" w:w="60"/>
               <w:left w:type="dxa" w:w="100"/>
@@ -50447,7 +50447,7 @@
       <w:tr>
         <w:tc>
           <w:tcPr>
-            <w:tcW w:type="dxa" w:w="2942"/>
+            <w:tcW w:type="dxa" w:w="2806"/>
             <w:tcMar>
               <w:top w:type="dxa" w:w="60"/>
               <w:left w:type="dxa" w:w="100"/>
@@ -50472,26 +50472,26 @@
         </w:tc>
         <w:tc>
           <w:tcPr>
-            <w:tcW w:type="dxa" w:w="6078"/>
-            <w:tcMar>
-              <w:top w:type="dxa" w:w="60"/>
-              <w:left w:type="dxa" w:w="100"/>
-              <w:bottom w:type="dxa" w:w="60"/>
-              <w:right w:type="dxa" w:w="100"/>
-            </w:tcMar>
-          </w:tcPr>
-          <w:p>
-            <w:pPr>
-              <w:spacing w:after="0" w:before="0"/>
-            </w:pPr>
-            <w:r>
-              <w:rPr>
-                <w:b w:val="false"/>
-                <w:bCs w:val="false"/>
-                <w:i w:val="false"/>
-                <w:iCs w:val="false"/>
-              </w:rPr>
-              <w:t xml:space="preserve">Perpetual licenses with Software Assurance for three years, providing updates, license mobility between the database hosts, and failover rights for the secondary copy</w:t>
+            <w:tcW w:type="dxa" w:w="6214"/>
+            <w:tcMar>
+              <w:top w:type="dxa" w:w="60"/>
+              <w:left w:type="dxa" w:w="100"/>
+              <w:bottom w:type="dxa" w:w="60"/>
+              <w:right w:type="dxa" w:w="100"/>
+            </w:tcMar>
+          </w:tcPr>
+          <w:p>
+            <w:pPr>
+              <w:spacing w:after="0" w:before="0"/>
+            </w:pPr>
+            <w:r>
+              <w:rPr>
+                <w:b w:val="false"/>
+                <w:bCs w:val="false"/>
+                <w:i w:val="false"/>
+                <w:iCs w:val="false"/>
+              </w:rPr>
+              <w:t xml:space="preserve">Perpetual server license and 120 client access licenses, with Software Assurance for three years, providing updates, license mobility between the database hosts, and failover rights for the secondary copy</w:t>
             </w:r>
           </w:p>
         </w:tc>
@@ -50499,7 +50499,7 @@
       <w:tr>
         <w:tc>
           <w:tcPr>
-            <w:tcW w:type="dxa" w:w="2942"/>
+            <w:tcW w:type="dxa" w:w="2806"/>
             <w:tcMar>
               <w:top w:type="dxa" w:w="60"/>
               <w:left w:type="dxa" w:w="100"/>
@@ -50524,7 +50524,7 @@
         </w:tc>
         <w:tc>
           <w:tcPr>
-            <w:tcW w:type="dxa" w:w="6078"/>
+            <w:tcW w:type="dxa" w:w="6214"/>
             <w:tcMar>
               <w:top w:type="dxa" w:w="60"/>
               <w:left w:type="dxa" w:w="100"/>
@@ -50551,7 +50551,7 @@
       <w:tr>
         <w:tc>
           <w:tcPr>
-            <w:tcW w:type="dxa" w:w="2942"/>
+            <w:tcW w:type="dxa" w:w="2806"/>
             <w:tcMar>
               <w:top w:type="dxa" w:w="60"/>
               <w:left w:type="dxa" w:w="100"/>
@@ -50576,7 +50576,7 @@
         </w:tc>
         <w:tc>
           <w:tcPr>
-            <w:tcW w:type="dxa" w:w="6078"/>
+            <w:tcW w:type="dxa" w:w="6214"/>
             <w:tcMar>
               <w:top w:type="dxa" w:w="60"/>
               <w:left w:type="dxa" w:w="100"/>
@@ -50603,7 +50603,7 @@
       <w:tr>
         <w:tc>
           <w:tcPr>
-            <w:tcW w:type="dxa" w:w="2942"/>
+            <w:tcW w:type="dxa" w:w="2806"/>
             <w:tcMar>
               <w:top w:type="dxa" w:w="60"/>
               <w:left w:type="dxa" w:w="100"/>
@@ -50628,7 +50628,7 @@
         </w:tc>
         <w:tc>
           <w:tcPr>
-            <w:tcW w:type="dxa" w:w="6078"/>
+            <w:tcW w:type="dxa" w:w="6214"/>
             <w:tcMar>
               <w:top w:type="dxa" w:w="60"/>
               <w:left w:type="dxa" w:w="100"/>
@@ -50655,7 +50655,7 @@
       <w:tr>
         <w:tc>
           <w:tcPr>
-            <w:tcW w:type="dxa" w:w="2942"/>
+            <w:tcW w:type="dxa" w:w="2806"/>
             <w:tcMar>
               <w:top w:type="dxa" w:w="60"/>
               <w:left w:type="dxa" w:w="100"/>
@@ -50680,7 +50680,7 @@
         </w:tc>
         <w:tc>
           <w:tcPr>
-            <w:tcW w:type="dxa" w:w="6078"/>
+            <w:tcW w:type="dxa" w:w="6214"/>
             <w:tcMar>
               <w:top w:type="dxa" w:w="60"/>
               <w:left w:type="dxa" w:w="100"/>

</xml_diff>